<commit_message>
Update storefront assets and delivery documents
</commit_message>
<xml_diff>
--- a/outputs/planning-v2.3/03_말마프렌즈_견적산정용_개발전달서_v2.3.docx
+++ b/outputs/planning-v2.3/03_말마프렌즈_견적산정용_개발전달서_v2.3.docx
@@ -34,7 +34,7 @@
         <w:spacing w:after="140"/>
       </w:pPr>
       <w:r>
-        <w:t>기존 렛츠런플레이에 회원용 굿즈 스토어를 추가하고, 기존 관리자에 커머스 운영 메뉴를 확장한다. 개발사는 아래 기본 범위 12개 항목과 선택 범위 2개 항목을 구분하여 공수와 비용을 산정한다. 금액과 일정은 개발사의 검토 후 확정한다.</w:t>
+        <w:t>기존 렛츠런플레이에 회원용 굿즈 스토어를 추가하고, 기존 관리자에 커머스 운영 메뉴를 확장한다. 개발사는 아래 기본 범위 11개 항목과 선택 범위 2개 항목을 구분하여 공수와 비용을 산정한다. 금액과 일정은 개발사의 검토 후 확정한다.</w:t>
       </w:r>
     </w:p>
     <w:p>
@@ -443,7 +443,7 @@
                 <w:color w:val="000000"/>
                 <w:sz w:val="20"/>
               </w:rPr>
-              <w:t>기본 범위 12개 항목 / 선택 범위 2개 항목 / 운영 실비 구분</w:t>
+              <w:t>기본 범위 11개 항목 / 선택 범위 2개 항목 / 운영 실비 구분</w:t>
             </w:r>
           </w:p>
         </w:tc>
@@ -658,7 +658,7 @@
                 <w:color w:val="000000"/>
                 <w:sz w:val="20"/>
               </w:rPr>
-              <w:t>스토어 진입, 상품 목록·상세, 대표 이미지·가격·품절·배송 및 취소 안내, 지정 노출 순서 반영</w:t>
+              <w:t>스토어 진입, 상품 목록·상세, 대표 이미지·가격·품절·배송 및 취소 안내, 최근 등록·수정 상품 우선 표시</w:t>
             </w:r>
           </w:p>
         </w:tc>
@@ -1394,7 +1394,7 @@
                 <w:color w:val="000000"/>
                 <w:sz w:val="20"/>
               </w:rPr>
-              <w:t>상품명·판매 상태 검색, 상품·대표 이미지·가격·재고·기본 설명 등록과 수정, 판매·품절·미노출 상태 관리</w:t>
+              <w:t>상품명·판매 상태 검색, 상품·대표 이미지·가격·재고·기본 설명 등록과 수정, 판매·품절·미노출 상태 관리, 등록·수정 시각 기록과 최근 수정순 자동 정렬</w:t>
             </w:r>
           </w:p>
         </w:tc>
@@ -1426,102 +1426,7 @@
               </w:rPr>
               <w:t>FN-021~022</w:t>
               <w:br/>
-              <w:t>FN-024</w:t>
-            </w:r>
-          </w:p>
-        </w:tc>
-      </w:tr>
-      <w:tr>
-        <w:trPr>
-          <w:cantSplit/>
-        </w:trPr>
-        <w:tc>
-          <w:tcPr>
-            <w:tcW w:type="dxa" w:w="1984"/>
-            <w:shd w:fill="F2F5F7"/>
-            <w:tcMar>
-              <w:top w:w="100" w:type="dxa"/>
-              <w:bottom w:w="100" w:type="dxa"/>
-              <w:left w:w="100" w:type="dxa"/>
-              <w:right w:w="100" w:type="dxa"/>
-            </w:tcMar>
-            <w:tcBorders>
-              <w:top w:val="single" w:sz="4" w:color="D9D9D9"/>
-              <w:bottom w:val="single" w:sz="4" w:color="D9D9D9"/>
-              <w:left w:val="single" w:sz="4" w:color="D9D9D9"/>
-              <w:right w:val="single" w:sz="4" w:color="D9D9D9"/>
-            </w:tcBorders>
-          </w:tcPr>
-          <w:p>
-            <w:pPr>
-              <w:spacing w:after="60" w:line="264" w:lineRule="auto"/>
-            </w:pPr>
-            <w:r>
-              <w:rPr>
-                <w:color w:val="000000"/>
-                <w:sz w:val="20"/>
-              </w:rPr>
-              <w:t>08 상품 노출 순서</w:t>
-            </w:r>
-          </w:p>
-        </w:tc>
-        <w:tc>
-          <w:tcPr>
-            <w:tcW w:type="dxa" w:w="6180"/>
-            <w:shd w:fill="F2F5F7"/>
-            <w:tcMar>
-              <w:top w:w="100" w:type="dxa"/>
-              <w:bottom w:w="100" w:type="dxa"/>
-              <w:left w:w="100" w:type="dxa"/>
-              <w:right w:w="100" w:type="dxa"/>
-            </w:tcMar>
-            <w:tcBorders>
-              <w:top w:val="single" w:sz="4" w:color="D9D9D9"/>
-              <w:bottom w:val="single" w:sz="4" w:color="D9D9D9"/>
-              <w:left w:val="single" w:sz="4" w:color="D9D9D9"/>
-              <w:right w:val="single" w:sz="4" w:color="D9D9D9"/>
-            </w:tcBorders>
-          </w:tcPr>
-          <w:p>
-            <w:pPr>
-              <w:spacing w:after="60" w:line="264" w:lineRule="auto"/>
-            </w:pPr>
-            <w:r>
-              <w:rPr>
-                <w:color w:val="000000"/>
-                <w:sz w:val="20"/>
-              </w:rPr>
-              <w:t>관리자에서 순서 지정, 사용자 상품 목록에 반영, 동일 순서 처리 기준 적용</w:t>
-            </w:r>
-          </w:p>
-        </w:tc>
-        <w:tc>
-          <w:tcPr>
-            <w:tcW w:type="dxa" w:w="1644"/>
-            <w:shd w:fill="F2F5F7"/>
-            <w:tcMar>
-              <w:top w:w="100" w:type="dxa"/>
-              <w:bottom w:w="100" w:type="dxa"/>
-              <w:left w:w="100" w:type="dxa"/>
-              <w:right w:w="100" w:type="dxa"/>
-            </w:tcMar>
-            <w:tcBorders>
-              <w:top w:val="single" w:sz="4" w:color="D9D9D9"/>
-              <w:bottom w:val="single" w:sz="4" w:color="D9D9D9"/>
-              <w:left w:val="single" w:sz="4" w:color="D9D9D9"/>
-              <w:right w:val="single" w:sz="4" w:color="D9D9D9"/>
-            </w:tcBorders>
-          </w:tcPr>
-          <w:p>
-            <w:pPr>
-              <w:spacing w:after="60" w:line="264" w:lineRule="auto"/>
-            </w:pPr>
-            <w:r>
-              <w:rPr>
-                <w:color w:val="000000"/>
-                <w:sz w:val="20"/>
-              </w:rPr>
-              <w:t>FN-025</w:t>
+              <w:t>FN-024~025</w:t>
             </w:r>
           </w:p>
         </w:tc>
@@ -1691,7 +1596,7 @@
                 <w:color w:val="000000"/>
                 <w:sz w:val="20"/>
               </w:rPr>
-              <w:t>09 데이터와 처리</w:t>
+              <w:t>08 데이터와 처리</w:t>
             </w:r>
           </w:p>
         </w:tc>
@@ -1756,7 +1661,7 @@
                 <w:color w:val="000000"/>
                 <w:sz w:val="20"/>
               </w:rPr>
-              <w:t>10 기존 시스템 연동</w:t>
+              <w:t>09 기존 시스템 연동</w:t>
             </w:r>
           </w:p>
         </w:tc>
@@ -1821,7 +1726,7 @@
                 <w:color w:val="000000"/>
                 <w:sz w:val="20"/>
               </w:rPr>
-              <w:t>11 파일과 운영 기록</w:t>
+              <w:t>10 파일과 운영 기록</w:t>
             </w:r>
           </w:p>
         </w:tc>
@@ -1886,7 +1791,7 @@
                 <w:color w:val="000000"/>
                 <w:sz w:val="20"/>
               </w:rPr>
-              <w:t>12 검증과 배포</w:t>
+              <w:t>11 검증과 배포</w:t>
             </w:r>
           </w:p>
         </w:tc>
@@ -3287,6 +3192,99 @@
         <w:tc>
           <w:tcPr>
             <w:tcW w:type="dxa" w:w="6406"/>
+            <w:shd w:fill="FFFFFF"/>
+            <w:tcMar>
+              <w:top w:w="100" w:type="dxa"/>
+              <w:bottom w:w="100" w:type="dxa"/>
+              <w:left w:w="100" w:type="dxa"/>
+              <w:right w:w="100" w:type="dxa"/>
+            </w:tcMar>
+            <w:tcBorders>
+              <w:top w:val="single" w:sz="4" w:color="D9D9D9"/>
+              <w:bottom w:val="single" w:sz="4" w:color="D9D9D9"/>
+              <w:left w:val="single" w:sz="4" w:color="D9D9D9"/>
+              <w:right w:val="single" w:sz="4" w:color="D9D9D9"/>
+            </w:tcBorders>
+          </w:tcPr>
+          <w:p>
+            <w:pPr>
+              <w:spacing w:after="60" w:line="264" w:lineRule="auto"/>
+            </w:pPr>
+            <w:r>
+              <w:rPr>
+                <w:color w:val="000000"/>
+                <w:sz w:val="20"/>
+              </w:rPr>
+              <w:t>08 데이터와 처리</w:t>
+            </w:r>
+          </w:p>
+        </w:tc>
+        <w:tc>
+          <w:tcPr>
+            <w:tcW w:type="dxa" w:w="1701"/>
+            <w:shd w:fill="FFFFFF"/>
+            <w:tcMar>
+              <w:top w:w="100" w:type="dxa"/>
+              <w:bottom w:w="100" w:type="dxa"/>
+              <w:left w:w="100" w:type="dxa"/>
+              <w:right w:w="100" w:type="dxa"/>
+            </w:tcMar>
+            <w:tcBorders>
+              <w:top w:val="single" w:sz="4" w:color="D9D9D9"/>
+              <w:bottom w:val="single" w:sz="4" w:color="D9D9D9"/>
+              <w:left w:val="single" w:sz="4" w:color="D9D9D9"/>
+              <w:right w:val="single" w:sz="4" w:color="D9D9D9"/>
+            </w:tcBorders>
+          </w:tcPr>
+          <w:p>
+            <w:pPr>
+              <w:spacing w:after="60" w:line="264" w:lineRule="auto"/>
+            </w:pPr>
+            <w:r>
+              <w:rPr>
+                <w:color w:val="000000"/>
+                <w:sz w:val="20"/>
+              </w:rPr>
+            </w:r>
+          </w:p>
+        </w:tc>
+        <w:tc>
+          <w:tcPr>
+            <w:tcW w:type="dxa" w:w="1701"/>
+            <w:shd w:fill="FFFFFF"/>
+            <w:tcMar>
+              <w:top w:w="100" w:type="dxa"/>
+              <w:bottom w:w="100" w:type="dxa"/>
+              <w:left w:w="100" w:type="dxa"/>
+              <w:right w:w="100" w:type="dxa"/>
+            </w:tcMar>
+            <w:tcBorders>
+              <w:top w:val="single" w:sz="4" w:color="D9D9D9"/>
+              <w:bottom w:val="single" w:sz="4" w:color="D9D9D9"/>
+              <w:left w:val="single" w:sz="4" w:color="D9D9D9"/>
+              <w:right w:val="single" w:sz="4" w:color="D9D9D9"/>
+            </w:tcBorders>
+          </w:tcPr>
+          <w:p>
+            <w:pPr>
+              <w:spacing w:after="60" w:line="264" w:lineRule="auto"/>
+            </w:pPr>
+            <w:r>
+              <w:rPr>
+                <w:color w:val="000000"/>
+                <w:sz w:val="20"/>
+              </w:rPr>
+            </w:r>
+          </w:p>
+        </w:tc>
+      </w:tr>
+      <w:tr>
+        <w:trPr>
+          <w:cantSplit/>
+        </w:trPr>
+        <w:tc>
+          <w:tcPr>
+            <w:tcW w:type="dxa" w:w="6406"/>
             <w:shd w:fill="F2F5F7"/>
             <w:tcMar>
               <w:top w:w="100" w:type="dxa"/>
@@ -3310,7 +3308,7 @@
                 <w:color w:val="000000"/>
                 <w:sz w:val="20"/>
               </w:rPr>
-              <w:t>08 상품 노출 순서</w:t>
+              <w:t>09 기존 시스템 연동</w:t>
             </w:r>
           </w:p>
         </w:tc>
@@ -3403,7 +3401,7 @@
                 <w:color w:val="000000"/>
                 <w:sz w:val="20"/>
               </w:rPr>
-              <w:t>09 데이터와 처리</w:t>
+              <w:t>10 파일과 운영 기록</w:t>
             </w:r>
           </w:p>
         </w:tc>
@@ -3496,193 +3494,7 @@
                 <w:color w:val="000000"/>
                 <w:sz w:val="20"/>
               </w:rPr>
-              <w:t>10 기존 시스템 연동</w:t>
-            </w:r>
-          </w:p>
-        </w:tc>
-        <w:tc>
-          <w:tcPr>
-            <w:tcW w:type="dxa" w:w="1701"/>
-            <w:shd w:fill="F2F5F7"/>
-            <w:tcMar>
-              <w:top w:w="100" w:type="dxa"/>
-              <w:bottom w:w="100" w:type="dxa"/>
-              <w:left w:w="100" w:type="dxa"/>
-              <w:right w:w="100" w:type="dxa"/>
-            </w:tcMar>
-            <w:tcBorders>
-              <w:top w:val="single" w:sz="4" w:color="D9D9D9"/>
-              <w:bottom w:val="single" w:sz="4" w:color="D9D9D9"/>
-              <w:left w:val="single" w:sz="4" w:color="D9D9D9"/>
-              <w:right w:val="single" w:sz="4" w:color="D9D9D9"/>
-            </w:tcBorders>
-          </w:tcPr>
-          <w:p>
-            <w:pPr>
-              <w:spacing w:after="60" w:line="264" w:lineRule="auto"/>
-            </w:pPr>
-            <w:r>
-              <w:rPr>
-                <w:color w:val="000000"/>
-                <w:sz w:val="20"/>
-              </w:rPr>
-            </w:r>
-          </w:p>
-        </w:tc>
-        <w:tc>
-          <w:tcPr>
-            <w:tcW w:type="dxa" w:w="1701"/>
-            <w:shd w:fill="F2F5F7"/>
-            <w:tcMar>
-              <w:top w:w="100" w:type="dxa"/>
-              <w:bottom w:w="100" w:type="dxa"/>
-              <w:left w:w="100" w:type="dxa"/>
-              <w:right w:w="100" w:type="dxa"/>
-            </w:tcMar>
-            <w:tcBorders>
-              <w:top w:val="single" w:sz="4" w:color="D9D9D9"/>
-              <w:bottom w:val="single" w:sz="4" w:color="D9D9D9"/>
-              <w:left w:val="single" w:sz="4" w:color="D9D9D9"/>
-              <w:right w:val="single" w:sz="4" w:color="D9D9D9"/>
-            </w:tcBorders>
-          </w:tcPr>
-          <w:p>
-            <w:pPr>
-              <w:spacing w:after="60" w:line="264" w:lineRule="auto"/>
-            </w:pPr>
-            <w:r>
-              <w:rPr>
-                <w:color w:val="000000"/>
-                <w:sz w:val="20"/>
-              </w:rPr>
-            </w:r>
-          </w:p>
-        </w:tc>
-      </w:tr>
-      <w:tr>
-        <w:trPr>
-          <w:cantSplit/>
-        </w:trPr>
-        <w:tc>
-          <w:tcPr>
-            <w:tcW w:type="dxa" w:w="6406"/>
-            <w:shd w:fill="FFFFFF"/>
-            <w:tcMar>
-              <w:top w:w="100" w:type="dxa"/>
-              <w:bottom w:w="100" w:type="dxa"/>
-              <w:left w:w="100" w:type="dxa"/>
-              <w:right w:w="100" w:type="dxa"/>
-            </w:tcMar>
-            <w:tcBorders>
-              <w:top w:val="single" w:sz="4" w:color="D9D9D9"/>
-              <w:bottom w:val="single" w:sz="4" w:color="D9D9D9"/>
-              <w:left w:val="single" w:sz="4" w:color="D9D9D9"/>
-              <w:right w:val="single" w:sz="4" w:color="D9D9D9"/>
-            </w:tcBorders>
-          </w:tcPr>
-          <w:p>
-            <w:pPr>
-              <w:spacing w:after="60" w:line="264" w:lineRule="auto"/>
-            </w:pPr>
-            <w:r>
-              <w:rPr>
-                <w:color w:val="000000"/>
-                <w:sz w:val="20"/>
-              </w:rPr>
-              <w:t>11 파일과 운영 기록</w:t>
-            </w:r>
-          </w:p>
-        </w:tc>
-        <w:tc>
-          <w:tcPr>
-            <w:tcW w:type="dxa" w:w="1701"/>
-            <w:shd w:fill="FFFFFF"/>
-            <w:tcMar>
-              <w:top w:w="100" w:type="dxa"/>
-              <w:bottom w:w="100" w:type="dxa"/>
-              <w:left w:w="100" w:type="dxa"/>
-              <w:right w:w="100" w:type="dxa"/>
-            </w:tcMar>
-            <w:tcBorders>
-              <w:top w:val="single" w:sz="4" w:color="D9D9D9"/>
-              <w:bottom w:val="single" w:sz="4" w:color="D9D9D9"/>
-              <w:left w:val="single" w:sz="4" w:color="D9D9D9"/>
-              <w:right w:val="single" w:sz="4" w:color="D9D9D9"/>
-            </w:tcBorders>
-          </w:tcPr>
-          <w:p>
-            <w:pPr>
-              <w:spacing w:after="60" w:line="264" w:lineRule="auto"/>
-            </w:pPr>
-            <w:r>
-              <w:rPr>
-                <w:color w:val="000000"/>
-                <w:sz w:val="20"/>
-              </w:rPr>
-            </w:r>
-          </w:p>
-        </w:tc>
-        <w:tc>
-          <w:tcPr>
-            <w:tcW w:type="dxa" w:w="1701"/>
-            <w:shd w:fill="FFFFFF"/>
-            <w:tcMar>
-              <w:top w:w="100" w:type="dxa"/>
-              <w:bottom w:w="100" w:type="dxa"/>
-              <w:left w:w="100" w:type="dxa"/>
-              <w:right w:w="100" w:type="dxa"/>
-            </w:tcMar>
-            <w:tcBorders>
-              <w:top w:val="single" w:sz="4" w:color="D9D9D9"/>
-              <w:bottom w:val="single" w:sz="4" w:color="D9D9D9"/>
-              <w:left w:val="single" w:sz="4" w:color="D9D9D9"/>
-              <w:right w:val="single" w:sz="4" w:color="D9D9D9"/>
-            </w:tcBorders>
-          </w:tcPr>
-          <w:p>
-            <w:pPr>
-              <w:spacing w:after="60" w:line="264" w:lineRule="auto"/>
-            </w:pPr>
-            <w:r>
-              <w:rPr>
-                <w:color w:val="000000"/>
-                <w:sz w:val="20"/>
-              </w:rPr>
-            </w:r>
-          </w:p>
-        </w:tc>
-      </w:tr>
-      <w:tr>
-        <w:trPr>
-          <w:cantSplit/>
-        </w:trPr>
-        <w:tc>
-          <w:tcPr>
-            <w:tcW w:type="dxa" w:w="6406"/>
-            <w:shd w:fill="F2F5F7"/>
-            <w:tcMar>
-              <w:top w:w="100" w:type="dxa"/>
-              <w:bottom w:w="100" w:type="dxa"/>
-              <w:left w:w="100" w:type="dxa"/>
-              <w:right w:w="100" w:type="dxa"/>
-            </w:tcMar>
-            <w:tcBorders>
-              <w:top w:val="single" w:sz="4" w:color="D9D9D9"/>
-              <w:bottom w:val="single" w:sz="4" w:color="D9D9D9"/>
-              <w:left w:val="single" w:sz="4" w:color="D9D9D9"/>
-              <w:right w:val="single" w:sz="4" w:color="D9D9D9"/>
-            </w:tcBorders>
-          </w:tcPr>
-          <w:p>
-            <w:pPr>
-              <w:spacing w:after="60" w:line="264" w:lineRule="auto"/>
-            </w:pPr>
-            <w:r>
-              <w:rPr>
-                <w:color w:val="000000"/>
-                <w:sz w:val="20"/>
-              </w:rPr>
-              <w:t>12 검증과 배포</w:t>
+              <w:t>11 검증과 배포</w:t>
             </w:r>
           </w:p>
         </w:tc>

</xml_diff>